<commit_message>
docs(bid): frame the pilot rate as co-funding, not a discount
Takes the procurement framing point: EUR 24,000 for ~480 h of effort reads as a
50% discount unless the document says otherwise, and a discount is precedent that
survives into the next negotiation.

Rewrites tuntiraportti §3 to name it co-funding — a one-off arrangement bound to
this engagement that ends when the pilot ends — and states explicitly that the
pilot's EUR 100/h does not carry into the follow-on contract or wider rollout
pricing, which stay at the EUR 120/h list rate from the sent price form §4.

Rate kept at EUR 120/h deliberately. That figure is in a document already sent to
Outokumpu (OUTOKUMPU_HINTALOMAKE.md §4, 27.6.2026); introducing a higher follow-on
rate anywhere in this pack would contradict it.

Co-Authored-By: Claude Opus 5 <noreply@anthropic.com>
Claude-Session: https://claude.ai/code/session_01VNPr3nCM6eS3vt4NyG1jBz
</commit_message>
<xml_diff>
--- a/Learn/OUTOKUMPU_TUNTIRAPORTTI.docx
+++ b/Learn/OUTOKUMPU_TUNTIRAPORTTI.docx
@@ -1539,7 +1539,51 @@
         <w:pStyle w:val="BodyText"/>
       </w:pPr>
       <w:r>
-        <w:t xml:space="preserve">Tämä ei ole alennus vaan investointi: pilotin tarkoitus on tuottaa mittausdata, jonka perusteella kaupallinen konversio joko perustellaan tai hylätään. Lifetime kantaa puolet siitä työstä, koska mittaustulos on arvokas myös meille.</w:t>
+        <w:rPr>
+          <w:bCs/>
+          <w:b/>
+        </w:rPr>
+        <w:t xml:space="preserve">Tämä ei ole alennus vaan yhteisrahoitus.</w:t>
+      </w:r>
+      <w:r>
+        <w:t xml:space="preserve"> </w:t>
+      </w:r>
+      <w:r>
+        <w:t xml:space="preserve">Pilotin tarkoitus on tuottaa mittausdata, jonka perusteella kaupallinen konversio joko perustellaan tai hylätään. Lifetime kantaa puolet työstä, koska mittaustulos on arvokas myös meille — emme myy tässä tuntityötä vaan hankimme yhdessä asiakkaan kanssa näytön siitä, toimiiko paikallinen arkkitehtuuri Tornion kaltaisessa ympäristössä.</w:t>
+      </w:r>
+    </w:p>
+    <w:p>
+      <w:pPr>
+        <w:pStyle w:val="BodyText"/>
+      </w:pPr>
+      <w:r>
+        <w:rPr>
+          <w:bCs/>
+          <w:b/>
+        </w:rPr>
+        <w:t xml:space="preserve">Ero alennuksen ja yhteisrahoituksen välillä on olennainen hinnoittelun kannalta.</w:t>
+      </w:r>
+      <w:r>
+        <w:t xml:space="preserve"> </w:t>
+      </w:r>
+      <w:r>
+        <w:t xml:space="preserve">Alennus laskee listahintaa ja jää voimaan seuraavassa neuvottelussa. Yhteisrahoitus on kertaluonteinen, rajattuun toimeksiantoon sidottu järjestely, joka päättyy pilotin päättyessä. Siksi §6 toteaa nimenomaisesti, että pilotin jälkeinen asiantuntijatyö laskutetaan hintalomakkeen §4 mukaisella listahinnalla</w:t>
+      </w:r>
+      <w:r>
+        <w:t xml:space="preserve"> </w:t>
+      </w:r>
+      <w:r>
+        <w:rPr>
+          <w:bCs/>
+          <w:b/>
+        </w:rPr>
+        <w:t xml:space="preserve">€120/h</w:t>
+      </w:r>
+      <w:r>
+        <w:t xml:space="preserve"> </w:t>
+      </w:r>
+      <w:r>
+        <w:t xml:space="preserve">— pilotin €100/h ei siirry jatkosopimukseen eikä laajemman käyttöönoton hinnoitteluun.</w:t>
       </w:r>
     </w:p>
     <w:p>

</xml_diff>